<commit_message>
Regenerate manuscript and cover letter binaries
</commit_message>
<xml_diff>
--- a/manuscript/Cover_letter_submission.docx
+++ b/manuscript/Cover_letter_submission.docx
@@ -2,7 +2,7 @@
 <file path=word/document.xml><?xml version="1.0" encoding="utf-8"?>
 <w:document xmlns:w="http://schemas.openxmlformats.org/wordprocessingml/2006/main" xmlns:m="http://schemas.openxmlformats.org/officeDocument/2006/math" xmlns:r="http://schemas.openxmlformats.org/officeDocument/2006/relationships" xmlns:o="urn:schemas-microsoft-com:office:office" xmlns:v="urn:schemas-microsoft-com:vml" xmlns:w10="urn:schemas-microsoft-com:office:word" xmlns:a="http://schemas.openxmlformats.org/drawingml/2006/main" xmlns:pic="http://schemas.openxmlformats.org/drawingml/2006/picture" xmlns:wp="http://schemas.openxmlformats.org/drawingml/2006/wordprocessingDrawing">
   <w:body>
-    <w:bookmarkStart w:id="23" w:name="cover-letter-for-plos-one"/>
+    <w:bookmarkStart w:id="25" w:name="cover-letter-for-plos-one"/>
     <w:p>
       <w:pPr>
         <w:pStyle w:val="Heading1"/>
@@ -24,7 +24,19 @@
         <w:pStyle w:val="BodyText"/>
       </w:pPr>
       <w:r>
-        <w:t xml:space="preserve">Please consider my manuscript, "Computational surveillance of Colombian public pharmaceutical procurement using public administrative data: a reproducible analysis of 2020-2026 contracts," for publication in PLOS ONE.</w:t>
+        <w:t xml:space="preserve">Please consider my manuscript,</w:t>
+      </w:r>
+      <w:r>
+        <w:t xml:space="preserve"> </w:t>
+      </w:r>
+      <w:r>
+        <w:t xml:space="preserve">“Computational surveillance of Colombian public pharmaceutical procurement using public administrative data: a reproducible analysis of 2020-2026 contracts,”</w:t>
+      </w:r>
+      <w:r>
+        <w:t xml:space="preserve"> </w:t>
+      </w:r>
+      <w:r>
+        <w:t xml:space="preserve">for publication in PLOS ONE.</w:t>
       </w:r>
     </w:p>
     <w:p>
@@ -64,7 +76,7 @@
         <w:pStyle w:val="BodyText"/>
       </w:pPr>
       <w:r>
-        <w:t xml:space="preserve">For reproducibility, the source code repository is available at</w:t>
+        <w:t xml:space="preserve">For reproducibility, the article-specific package is archived at Zenodo under DOI</w:t>
       </w:r>
       <w:r>
         <w:t xml:space="preserve"> </w:t>
@@ -74,11 +86,42 @@
           <w:rPr>
             <w:rStyle w:val="Hyperlink"/>
           </w:rPr>
-          <w:t xml:space="preserve">https://github.com/zswamtech/BigLoI-PMV</w:t>
+          <w:t xml:space="preserve">https://doi.org/10.5281/zenodo.19074137</w:t>
         </w:r>
       </w:hyperlink>
       <w:r>
-        <w:t xml:space="preserve">. The public observatory URL will be incorporated into the final editorial record once the production deployment is finalized.</w:t>
+        <w:t xml:space="preserve"> </w:t>
+      </w:r>
+      <w:r>
+        <w:t xml:space="preserve">and is also available in the dedicated public repository at</w:t>
+      </w:r>
+      <w:r>
+        <w:t xml:space="preserve"> </w:t>
+      </w:r>
+      <w:hyperlink r:id="rId21">
+        <w:r>
+          <w:rPr>
+            <w:rStyle w:val="Hyperlink"/>
+          </w:rPr>
+          <w:t xml:space="preserve">https://github.com/zswamtech/BigLoI-PLOS-ONE-paper</w:t>
+        </w:r>
+      </w:hyperlink>
+      <w:r>
+        <w:t xml:space="preserve">. The public observatory is available at</w:t>
+      </w:r>
+      <w:r>
+        <w:t xml:space="preserve"> </w:t>
+      </w:r>
+      <w:hyperlink r:id="rId22">
+        <w:r>
+          <w:rPr>
+            <w:rStyle w:val="Hyperlink"/>
+          </w:rPr>
+          <w:t xml:space="preserve">https://www.bigloi.com/observatorio</w:t>
+        </w:r>
+      </w:hyperlink>
+      <w:r>
+        <w:t xml:space="preserve">.</w:t>
       </w:r>
     </w:p>
     <w:p>
@@ -119,7 +162,7 @@
       <w:r>
         <w:t xml:space="preserve"> </w:t>
       </w:r>
-      <w:hyperlink r:id="rId21">
+      <w:hyperlink r:id="rId23">
         <w:r>
           <w:rPr>
             <w:rStyle w:val="Hyperlink"/>
@@ -130,7 +173,7 @@
       <w:r>
         <w:t xml:space="preserve"> </w:t>
       </w:r>
-      <w:hyperlink r:id="rId22">
+      <w:hyperlink r:id="rId24">
         <w:r>
           <w:rPr>
             <w:rStyle w:val="Hyperlink"/>
@@ -139,7 +182,7 @@
         </w:r>
       </w:hyperlink>
     </w:p>
-    <w:bookmarkEnd w:id="23"/>
+    <w:bookmarkEnd w:id="25"/>
     <w:sectPr>
       <w:footnotePr>
         <w:numRestart w:val="eachSect"/>

</xml_diff>

<commit_message>
Withdraw observatory URL from editorial artifacts
</commit_message>
<xml_diff>
--- a/manuscript/Cover_letter_submission.docx
+++ b/manuscript/Cover_letter_submission.docx
@@ -2,7 +2,7 @@
 <file path=word/document.xml><?xml version="1.0" encoding="utf-8"?>
 <w:document xmlns:w="http://schemas.openxmlformats.org/wordprocessingml/2006/main" xmlns:m="http://schemas.openxmlformats.org/officeDocument/2006/math" xmlns:r="http://schemas.openxmlformats.org/officeDocument/2006/relationships" xmlns:o="urn:schemas-microsoft-com:office:office" xmlns:v="urn:schemas-microsoft-com:vml" xmlns:w10="urn:schemas-microsoft-com:office:word" xmlns:a="http://schemas.openxmlformats.org/drawingml/2006/main" xmlns:pic="http://schemas.openxmlformats.org/drawingml/2006/picture" xmlns:wp="http://schemas.openxmlformats.org/drawingml/2006/wordprocessingDrawing">
   <w:body>
-    <w:bookmarkStart w:id="25" w:name="cover-letter-for-plos-one"/>
+    <w:bookmarkStart w:id="24" w:name="cover-letter-for-plos-one"/>
     <w:p>
       <w:pPr>
         <w:pStyle w:val="Heading1"/>
@@ -107,21 +107,7 @@
         </w:r>
       </w:hyperlink>
       <w:r>
-        <w:t xml:space="preserve">. The public observatory is available at</w:t>
-      </w:r>
-      <w:r>
-        <w:t xml:space="preserve"> </w:t>
-      </w:r>
-      <w:hyperlink r:id="rId22">
-        <w:r>
-          <w:rPr>
-            <w:rStyle w:val="Hyperlink"/>
-          </w:rPr>
-          <w:t xml:space="preserve">https://www.bigloi.com/observatorio</w:t>
-        </w:r>
-      </w:hyperlink>
-      <w:r>
-        <w:t xml:space="preserve">.</w:t>
+        <w:t xml:space="preserve">. The public observatory derived from the project is not cited as a live URL in this submission version because its production deployment is being finalized; the archived package therefore serves as the authoritative record for editorial evaluation.</w:t>
       </w:r>
     </w:p>
     <w:p>
@@ -162,7 +148,7 @@
       <w:r>
         <w:t xml:space="preserve"> </w:t>
       </w:r>
-      <w:hyperlink r:id="rId23">
+      <w:hyperlink r:id="rId22">
         <w:r>
           <w:rPr>
             <w:rStyle w:val="Hyperlink"/>
@@ -173,7 +159,7 @@
       <w:r>
         <w:t xml:space="preserve"> </w:t>
       </w:r>
-      <w:hyperlink r:id="rId24">
+      <w:hyperlink r:id="rId23">
         <w:r>
           <w:rPr>
             <w:rStyle w:val="Hyperlink"/>
@@ -182,7 +168,7 @@
         </w:r>
       </w:hyperlink>
     </w:p>
-    <w:bookmarkEnd w:id="25"/>
+    <w:bookmarkEnd w:id="24"/>
     <w:sectPr>
       <w:footnotePr>
         <w:numRestart w:val="eachSect"/>

</xml_diff>

<commit_message>
revision: bundle + prosa R2-2/5/6 + R1-3 evidencia + figuras EN + paquete docx
</commit_message>
<xml_diff>
--- a/manuscript/Cover_letter_submission.docx
+++ b/manuscript/Cover_letter_submission.docx
@@ -30,7 +30,7 @@
         <w:t xml:space="preserve"> </w:t>
       </w:r>
       <w:r>
-        <w:t xml:space="preserve">“Computational surveillance of Colombian public pharmaceutical procurement using public administrative data: a reproducible analysis of 2020-2026 contracts,”</w:t>
+        <w:t xml:space="preserve">“Computational surveillance of Colombian public pharmaceutical procurement using public administrative data: a reproducible analysis of a closed 2020-2025 cohort,”</w:t>
       </w:r>
       <w:r>
         <w:t xml:space="preserve"> </w:t>
@@ -44,7 +44,7 @@
         <w:pStyle w:val="BodyText"/>
       </w:pPr>
       <w:r>
-        <w:t xml:space="preserve">This study describes and evaluates a reproducible computational infrastructure for surveillance of Colombian public pharmaceutical procurement using public administrative data from SECOP-II, INVIMA, and SISMED. The manuscript reports the integration of these sources into an open analytical workflow combining relational storage, statistical anomaly detection, and a public-facing observatory. Using a database of 162,921 pharmaceutical contracts, I identified statistically atypical procurement patterns, documented marked market concentration, and generated auditable outputs from otherwise fragmented public data sources.</w:t>
+        <w:t xml:space="preserve">This study describes and evaluates a reproducible computational infrastructure for surveillance of Colombian public pharmaceutical procurement using public administrative data from SECOP-II, INVIMA, and SISMED. The manuscript reports the integration of these sources into an open analytical workflow combining relational storage, statistical anomaly detection, and a public-facing observatory. Using a closed analytical cohort of 162,271 pharmaceutical contracts from 2020 to 2025, I identified statistically atypical procurement patterns, documented marked market concentration, and generated auditable outputs from otherwise fragmented public data sources.</w:t>
       </w:r>
     </w:p>
     <w:p>

</xml_diff>

<commit_message>
release: sync PONE-D-26-13579R2 reproducibility package (v0.2.0)
Publish the corrected closed cohort (161,830), reviewer clarifications, figures, and veterinary-exclusion audit artifacts so GitHub/Zenodo match the submitted revision.
</commit_message>
<xml_diff>
--- a/manuscript/Cover_letter_submission.docx
+++ b/manuscript/Cover_letter_submission.docx
@@ -2,7 +2,7 @@
 <file path=word/document.xml><?xml version="1.0" encoding="utf-8"?>
 <w:document xmlns:w="http://schemas.openxmlformats.org/wordprocessingml/2006/main" xmlns:m="http://schemas.openxmlformats.org/officeDocument/2006/math" xmlns:r="http://schemas.openxmlformats.org/officeDocument/2006/relationships" xmlns:o="urn:schemas-microsoft-com:office:office" xmlns:v="urn:schemas-microsoft-com:vml" xmlns:w10="urn:schemas-microsoft-com:office:word" xmlns:a="http://schemas.openxmlformats.org/drawingml/2006/main" xmlns:pic="http://schemas.openxmlformats.org/drawingml/2006/picture" xmlns:wp="http://schemas.openxmlformats.org/drawingml/2006/wordprocessingDrawing">
   <w:body>
-    <w:bookmarkStart w:id="24" w:name="cover-letter-for-plos-one"/>
+    <w:bookmarkStart w:id="20" w:name="cover-letter-for-plos-one"/>
     <w:p>
       <w:pPr>
         <w:pStyle w:val="Heading1"/>
@@ -16,7 +16,17 @@
         <w:pStyle w:val="FirstParagraph"/>
       </w:pPr>
       <w:r>
-        <w:t xml:space="preserve">Dear Editors of PLOS ONE,</w:t>
+        <w:rPr>
+          <w:b/>
+          <w:bCs/>
+        </w:rPr>
+        <w:t xml:space="preserve">Manuscript ID:</w:t>
+      </w:r>
+      <w:r>
+        <w:t xml:space="preserve"> </w:t>
+      </w:r>
+      <w:r>
+        <w:t xml:space="preserve">PONE-D-26-13579R1</w:t>
       </w:r>
     </w:p>
     <w:p>
@@ -24,19 +34,7 @@
         <w:pStyle w:val="BodyText"/>
       </w:pPr>
       <w:r>
-        <w:t xml:space="preserve">Please consider my manuscript,</w:t>
-      </w:r>
-      <w:r>
-        <w:t xml:space="preserve"> </w:t>
-      </w:r>
-      <w:r>
-        <w:t xml:space="preserve">“Computational surveillance of Colombian public pharmaceutical procurement using public administrative data: a reproducible analysis of a closed 2020-2025 cohort,”</w:t>
-      </w:r>
-      <w:r>
-        <w:t xml:space="preserve"> </w:t>
-      </w:r>
-      <w:r>
-        <w:t xml:space="preserve">for publication in PLOS ONE.</w:t>
+        <w:t xml:space="preserve">Dear Dr. Sun and Editors of PLOS ONE,</w:t>
       </w:r>
     </w:p>
     <w:p>
@@ -44,7 +42,19 @@
         <w:pStyle w:val="BodyText"/>
       </w:pPr>
       <w:r>
-        <w:t xml:space="preserve">This study describes and evaluates a reproducible computational infrastructure for surveillance of Colombian public pharmaceutical procurement using public administrative data from SECOP-II, INVIMA, and SISMED. The manuscript reports the integration of these sources into an open analytical workflow combining relational storage, statistical anomaly detection, and a public-facing observatory. Using a closed analytical cohort of 162,271 pharmaceutical contracts from 2020 to 2025, I identified statistically atypical procurement patterns, documented marked market concentration, and generated auditable outputs from otherwise fragmented public data sources.</w:t>
+        <w:t xml:space="preserve">Please find enclosed the revised manuscript,</w:t>
+      </w:r>
+      <w:r>
+        <w:t xml:space="preserve"> </w:t>
+      </w:r>
+      <w:r>
+        <w:t xml:space="preserve">“Computational surveillance of Colombian public pharmaceutical procurement using public administrative data: a reproducible analysis of a closed 2020-2025 cohort,”</w:t>
+      </w:r>
+      <w:r>
+        <w:t xml:space="preserve"> </w:t>
+      </w:r>
+      <w:r>
+        <w:t xml:space="preserve">for reconsideration by PLOS ONE.</w:t>
       </w:r>
     </w:p>
     <w:p>
@@ -52,7 +62,7 @@
         <w:pStyle w:val="BodyText"/>
       </w:pPr>
       <w:r>
-        <w:t xml:space="preserve">I believe the manuscript is well suited to PLOS ONE because its principal contribution is methodological and reproducible rather than journal- or country-specific. The work presents a transparent computational framework that can be evaluated, reused, and adapted in other settings where public procurement data are available but underused for systematic surveillance. In addition to its relevance for pharmaceutical policy and public-sector auditing, the study contributes to the broader literature on open computational infrastructures, administrative data reuse, and applied analytical methods for public-interest oversight.</w:t>
+        <w:t xml:space="preserve">This study describes and evaluates a reproducible computational infrastructure for surveillance of Colombian public pharmaceutical procurement using public administrative data from SECOP-II, INVIMA, and SISMED. The manuscript reports the integration of these sources into an open analytical workflow combining relational storage, statistical anomaly detection, and a public-facing observatory. Using a corrected closed analytical cohort of 161,830 pharmaceutical contracts from 2020 to 2025 (after contract-level exclusion of 441 veterinary/agricultural records from a 162,271-contract source cohort), I identified statistically atypical procurement patterns, documented marked market concentration, and generated auditable outputs from otherwise fragmented public data sources.</w:t>
       </w:r>
     </w:p>
     <w:p>
@@ -60,7 +70,7 @@
         <w:pStyle w:val="BodyText"/>
       </w:pPr>
       <w:r>
-        <w:t xml:space="preserve">The manuscript uses exclusively public, non-personal administrative data. No clinical, laboratory, or identifiable patient-level data were used. Under Colombian regulations, the study is classified as research without risk. The blockchain-based payment-cycle component is presented only as a complementary functional proof of concept and not as the central empirical contribution of the manuscript; it does not report real-world operational timings.</w:t>
+        <w:t xml:space="preserve">I believe the manuscript remains well suited to PLOS ONE because its principal contribution is methodological and reproducible rather than journal- or country-specific. The work presents a transparent computational framework that can be evaluated, reused, and adapted in other settings where public procurement data are available but underused for systematic surveillance.</w:t>
       </w:r>
     </w:p>
     <w:p>
@@ -68,7 +78,7 @@
         <w:pStyle w:val="BodyText"/>
       </w:pPr>
       <w:r>
-        <w:t xml:space="preserve">This submission is original, has not been published previously, and is not under consideration elsewhere. I have reviewed the manuscript, approve its submission, and agree to be accountable for the work. I have no competing interests to declare. The study was conducted without external funding.</w:t>
+        <w:t xml:space="preserve">In this revision I have addressed every point raised by Reviewers #1 and #2 in a separate Response to Reviewers file. No changes to the financial disclosure are required: the study was conducted without external funding. The manuscript uses exclusively public, non-personal administrative data. No clinical, laboratory, or identifiable patient-level data were used. Under Colombian regulations, the study is classified as research without risk. The blockchain-based payment-cycle component is presented only as a complementary functional proof of concept and not as the central empirical contribution of the manuscript.</w:t>
       </w:r>
     </w:p>
     <w:p>
@@ -76,38 +86,7 @@
         <w:pStyle w:val="BodyText"/>
       </w:pPr>
       <w:r>
-        <w:t xml:space="preserve">For reproducibility, the article-specific package is archived at Zenodo under DOI</w:t>
-      </w:r>
-      <w:r>
-        <w:t xml:space="preserve"> </w:t>
-      </w:r>
-      <w:hyperlink r:id="rId20">
-        <w:r>
-          <w:rPr>
-            <w:rStyle w:val="Hyperlink"/>
-          </w:rPr>
-          <w:t xml:space="preserve">https://doi.org/10.5281/zenodo.19074137</w:t>
-        </w:r>
-      </w:hyperlink>
-      <w:r>
-        <w:t xml:space="preserve"> </w:t>
-      </w:r>
-      <w:r>
-        <w:t xml:space="preserve">and is also available in the dedicated public repository at</w:t>
-      </w:r>
-      <w:r>
-        <w:t xml:space="preserve"> </w:t>
-      </w:r>
-      <w:hyperlink r:id="rId21">
-        <w:r>
-          <w:rPr>
-            <w:rStyle w:val="Hyperlink"/>
-          </w:rPr>
-          <w:t xml:space="preserve">https://github.com/zswamtech/BigLoI-PLOS-ONE-paper</w:t>
-        </w:r>
-      </w:hyperlink>
-      <w:r>
-        <w:t xml:space="preserve">. The public observatory derived from the project is not cited as a live URL in this submission version because its production deployment is being finalized; the archived package therefore serves as the authoritative record for editorial evaluation.</w:t>
+        <w:t xml:space="preserve">This submission is original, has not been published previously, and is not under consideration elsewhere. I have reviewed the manuscript, approve its submission, and agree to be accountable for the work. I have no competing interests to declare.</w:t>
       </w:r>
     </w:p>
     <w:p>
@@ -115,7 +94,7 @@
         <w:pStyle w:val="BodyText"/>
       </w:pPr>
       <w:r>
-        <w:t xml:space="preserve">Thank you for your consideration.</w:t>
+        <w:t xml:space="preserve">For reproducibility, the article-specific package is archived at Zenodo under DOI https://doi.org/10.5281/zenodo.19074137 and is also available in the dedicated public repository at https://github.com/zswamtech/BigLoI-PLOS-ONE-paper.</w:t>
       </w:r>
     </w:p>
     <w:p>
@@ -123,7 +102,7 @@
         <w:pStyle w:val="BodyText"/>
       </w:pPr>
       <w:r>
-        <w:t xml:space="preserve">Sincerely,</w:t>
+        <w:t xml:space="preserve">Thank you for your consideration.</w:t>
       </w:r>
     </w:p>
     <w:p>
@@ -131,6 +110,14 @@
         <w:pStyle w:val="BodyText"/>
       </w:pPr>
       <w:r>
+        <w:t xml:space="preserve">Sincerely,</w:t>
+      </w:r>
+    </w:p>
+    <w:p>
+      <w:pPr>
+        <w:pStyle w:val="BodyText"/>
+      </w:pPr>
+      <w:r>
         <w:t xml:space="preserve">Andres Soto</w:t>
       </w:r>
       <w:r>
@@ -148,27 +135,17 @@
       <w:r>
         <w:t xml:space="preserve"> </w:t>
       </w:r>
-      <w:hyperlink r:id="rId22">
-        <w:r>
-          <w:rPr>
-            <w:rStyle w:val="Hyperlink"/>
-          </w:rPr>
-          <w:t xml:space="preserve">ansoto1604@icloud.com</w:t>
-        </w:r>
-      </w:hyperlink>
+      <w:r>
+        <w:t xml:space="preserve">ansoto1604@icloud.com</w:t>
+      </w:r>
       <w:r>
         <w:t xml:space="preserve"> </w:t>
       </w:r>
-      <w:hyperlink r:id="rId23">
-        <w:r>
-          <w:rPr>
-            <w:rStyle w:val="Hyperlink"/>
-          </w:rPr>
-          <w:t xml:space="preserve">https://orcid.org/0009-0004-8001-5372</w:t>
-        </w:r>
-      </w:hyperlink>
+      <w:r>
+        <w:t xml:space="preserve">https://orcid.org/0009-0004-8001-5372</w:t>
+      </w:r>
     </w:p>
-    <w:bookmarkEnd w:id="24"/>
+    <w:bookmarkEnd w:id="20"/>
     <w:sectPr>
       <w:footnotePr>
         <w:numRestart w:val="eachSect"/>

</xml_diff>